<commit_message>
detalle de pedido + almacenamiento y arrays hardcodeados para prueba
</commit_message>
<xml_diff>
--- a/Roadmap_GC.docx
+++ b/Roadmap_GC.docx
@@ -14,7 +14,7 @@
           <w:rFonts w:ascii="Arial" w:hAnsi="Arial"/>
           <w:b/>
           <w:color w:val="1E3A8A"/>
-          <w:sz w:val="40"/>
+          <w:sz w:val="36"/>
         </w:rPr>
         <w:t>Plan de Ejecución y Roadmap</w:t>
         <w:br/>
@@ -24,12 +24,12 @@
     <w:p>
       <w:pPr>
         <w:pStyle w:val="Normal"/>
-        <w:spacing w:before="0" w:after="120"/>
+        <w:spacing w:before="0" w:after="240"/>
         <w:rPr/>
       </w:pPr>
       <w:r>
         <w:rPr/>
-        <w:t>Este documento define el cronograma de ejecución del proyecto, secuenciado en 5 fases principales acorde a la línea de tiempo establecida y enfocado en cumplir los requisitos funcionales documentados.</w:t>
+        <w:t>Este documento define el cronograma de ejecución del proyecto, secuenciado en 5 fases principales acorde a la línea de tiempo establecida y enfocado en cumplir los requisitos funcionales mediante etapas cortas y objetivos.</w:t>
       </w:r>
     </w:p>
     <w:tbl>
@@ -64,7 +64,9 @@
           <w:p>
             <w:pPr>
               <w:pStyle w:val="Normal"/>
-              <w:spacing w:before="0" w:after="200"/>
+              <w:widowControl/>
+              <w:bidi w:val="0"/>
+              <w:spacing w:lineRule="auto" w:line="276" w:before="0" w:after="200"/>
               <w:jc w:val="left"/>
               <w:rPr/>
             </w:pPr>
@@ -72,7 +74,6 @@
               <w:rPr>
                 <w:b/>
                 <w:color w:val="FFFFFF"/>
-                <w:sz w:val="20"/>
               </w:rPr>
               <w:t>Fase</w:t>
             </w:r>
@@ -90,7 +91,9 @@
           <w:p>
             <w:pPr>
               <w:pStyle w:val="Normal"/>
-              <w:spacing w:before="0" w:after="200"/>
+              <w:widowControl/>
+              <w:bidi w:val="0"/>
+              <w:spacing w:lineRule="auto" w:line="276" w:before="0" w:after="200"/>
               <w:jc w:val="left"/>
               <w:rPr/>
             </w:pPr>
@@ -98,7 +101,6 @@
               <w:rPr>
                 <w:b/>
                 <w:color w:val="FFFFFF"/>
-                <w:sz w:val="20"/>
               </w:rPr>
               <w:t>Fecha Límite</w:t>
             </w:r>
@@ -116,7 +118,9 @@
           <w:p>
             <w:pPr>
               <w:pStyle w:val="Normal"/>
-              <w:spacing w:before="0" w:after="200"/>
+              <w:widowControl/>
+              <w:bidi w:val="0"/>
+              <w:spacing w:lineRule="auto" w:line="276" w:before="0" w:after="200"/>
               <w:jc w:val="left"/>
               <w:rPr/>
             </w:pPr>
@@ -124,9 +128,8 @@
               <w:rPr>
                 <w:b/>
                 <w:color w:val="FFFFFF"/>
-                <w:sz w:val="20"/>
               </w:rPr>
-              <w:t>Tareas y Requisitos Asociados</w:t>
+              <w:t>Etapas Cortas y Tareas Específicas</w:t>
             </w:r>
           </w:p>
         </w:tc>
@@ -172,7 +175,10 @@
           <w:p>
             <w:pPr>
               <w:pStyle w:val="Normal"/>
-              <w:spacing w:before="0" w:after="200"/>
+              <w:widowControl/>
+              <w:bidi w:val="0"/>
+              <w:spacing w:lineRule="auto" w:line="276" w:before="0" w:after="200"/>
+              <w:jc w:val="left"/>
               <w:rPr/>
             </w:pPr>
             <w:r>
@@ -180,7 +186,7 @@
                 <w:b/>
                 <w:color w:val="475569"/>
               </w:rPr>
-              <w:t>3 de Septiembre</w:t>
+              <w:t>03 de Septiembre</w:t>
             </w:r>
           </w:p>
         </w:tc>
@@ -196,21 +202,56 @@
           <w:p>
             <w:pPr>
               <w:pStyle w:val="Normal"/>
-              <w:widowControl/>
-              <w:bidi w:val="0"/>
-              <w:spacing w:lineRule="auto" w:line="276" w:before="0" w:after="200"/>
-              <w:jc w:val="left"/>
+              <w:spacing w:before="0" w:after="40"/>
               <w:rPr/>
             </w:pPr>
             <w:r>
+              <w:rPr>
+                <w:b/>
+              </w:rPr>
+              <w:t>Etapa 1: Definición Formal</w:t>
+            </w:r>
+          </w:p>
+          <w:p>
+            <w:pPr>
+              <w:pStyle w:val="Normal"/>
+              <w:spacing w:lineRule="auto" w:line="264" w:before="0" w:after="40"/>
+              <w:ind w:left="216" w:hanging="0"/>
               <w:rPr/>
+            </w:pPr>
+            <w:r>
+              <w:rPr>
+                <w:b/>
+                <w:color w:val="475569"/>
+              </w:rPr>
               <w:t xml:space="preserve">• </w:t>
             </w:r>
             <w:r>
+              <w:rPr>
+                <w:sz w:val="19"/>
+              </w:rPr>
+              <w:t>Redacción de requisitos funcionales y no funcionales.</w:t>
+            </w:r>
+          </w:p>
+          <w:p>
+            <w:pPr>
+              <w:pStyle w:val="Normal"/>
+              <w:spacing w:lineRule="auto" w:line="264" w:before="0" w:after="40"/>
+              <w:ind w:left="216" w:hanging="0"/>
               <w:rPr/>
-              <w:t>Redacción y aprobación del documento de requisitos funcionales y no funcionales.</w:t>
-              <w:br/>
-              <w:t>• Definición de alcances, usuarios y matriz de trazabilidad.</w:t>
+            </w:pPr>
+            <w:r>
+              <w:rPr>
+                <w:b/>
+                <w:color w:val="475569"/>
+              </w:rPr>
+              <w:t xml:space="preserve">• </w:t>
+            </w:r>
+            <w:r>
+              <w:rPr>
+                <w:sz w:val="19"/>
+              </w:rPr>
+              <w:t>Definición de alcances, usuarios y matriz de trazabilidad.</w:t>
             </w:r>
           </w:p>
         </w:tc>
@@ -283,23 +324,77 @@
           <w:p>
             <w:pPr>
               <w:pStyle w:val="Normal"/>
-              <w:widowControl/>
-              <w:bidi w:val="0"/>
-              <w:spacing w:lineRule="auto" w:line="276" w:before="0" w:after="200"/>
-              <w:jc w:val="left"/>
+              <w:spacing w:before="0" w:after="40"/>
               <w:rPr/>
             </w:pPr>
             <w:r>
+              <w:rPr>
+                <w:b/>
+              </w:rPr>
+              <w:t>Etapa 1: Estructura del Proyecto</w:t>
+            </w:r>
+          </w:p>
+          <w:p>
+            <w:pPr>
+              <w:pStyle w:val="Normal"/>
+              <w:spacing w:lineRule="auto" w:line="264" w:before="0" w:after="40"/>
+              <w:ind w:left="216" w:hanging="0"/>
               <w:rPr/>
+            </w:pPr>
+            <w:r>
+              <w:rPr>
+                <w:b/>
+                <w:color w:val="475569"/>
+              </w:rPr>
               <w:t xml:space="preserve">• </w:t>
             </w:r>
             <w:r>
+              <w:rPr>
+                <w:sz w:val="19"/>
+              </w:rPr>
+              <w:t>Definición del patrón arquitectónico en capas.</w:t>
+            </w:r>
+          </w:p>
+          <w:p>
+            <w:pPr>
+              <w:pStyle w:val="Normal"/>
+              <w:spacing w:lineRule="auto" w:line="264" w:before="0" w:after="40"/>
+              <w:ind w:left="216" w:hanging="0"/>
               <w:rPr/>
-              <w:t>Definición del patrón arquitectónico en capas.</w:t>
-              <w:br/>
-              <w:t>• Configuración inicial del repositorio y stack base (React, FastAPI, PostgreSQL).</w:t>
-              <w:br/>
-              <w:t>• Estructuración de base de datos.</w:t>
+            </w:pPr>
+            <w:r>
+              <w:rPr>
+                <w:b/>
+                <w:color w:val="475569"/>
+              </w:rPr>
+              <w:t xml:space="preserve">• </w:t>
+            </w:r>
+            <w:r>
+              <w:rPr>
+                <w:sz w:val="19"/>
+              </w:rPr>
+              <w:t>Configuración inicial del repositorio (React, FastAPI).</w:t>
+            </w:r>
+          </w:p>
+          <w:p>
+            <w:pPr>
+              <w:pStyle w:val="Normal"/>
+              <w:spacing w:lineRule="auto" w:line="264" w:before="0" w:after="40"/>
+              <w:ind w:left="216" w:hanging="0"/>
+              <w:rPr/>
+            </w:pPr>
+            <w:r>
+              <w:rPr>
+                <w:b/>
+                <w:color w:val="475569"/>
+              </w:rPr>
+              <w:t xml:space="preserve">• </w:t>
+            </w:r>
+            <w:r>
+              <w:rPr>
+                <w:sz w:val="19"/>
+              </w:rPr>
+              <w:t>Modelado y estructuración inicial de PostgreSQL.</w:t>
             </w:r>
           </w:p>
         </w:tc>
@@ -372,27 +467,402 @@
           <w:p>
             <w:pPr>
               <w:pStyle w:val="Normal"/>
-              <w:widowControl/>
-              <w:bidi w:val="0"/>
-              <w:spacing w:lineRule="auto" w:line="276" w:before="0" w:after="200"/>
-              <w:jc w:val="left"/>
+              <w:spacing w:before="0" w:after="40"/>
               <w:rPr/>
             </w:pPr>
             <w:r>
+              <w:rPr>
+                <w:b/>
+              </w:rPr>
+              <w:t>Etapa 1: Base y Autenticación</w:t>
+            </w:r>
+          </w:p>
+          <w:p>
+            <w:pPr>
+              <w:pStyle w:val="Normal"/>
+              <w:spacing w:lineRule="auto" w:line="264" w:before="0" w:after="40"/>
+              <w:ind w:left="216" w:hanging="0"/>
               <w:rPr/>
+            </w:pPr>
+            <w:r>
+              <w:rPr>
+                <w:b/>
+                <w:color w:val="475569"/>
+              </w:rPr>
               <w:t xml:space="preserve">• </w:t>
             </w:r>
             <w:r>
+              <w:rPr>
+                <w:sz w:val="19"/>
+              </w:rPr>
+              <w:t>Setup de React Router, Tailwind y layout principal (Sidebar).</w:t>
+            </w:r>
+          </w:p>
+          <w:p>
+            <w:pPr>
+              <w:pStyle w:val="Normal"/>
+              <w:spacing w:lineRule="auto" w:line="264" w:before="0" w:after="40"/>
+              <w:ind w:left="216" w:hanging="0"/>
               <w:rPr/>
-              <w:t>Maquetación UI/UX base y sistema de ruteo.</w:t>
-              <w:br/>
-              <w:t>• Desarrollo ABM/CRUD visual (Usuarios, Productos, Proveedores, Clientes) [RF-01 al RF-05, RF-08, RF-09, RF-12, RF-13].</w:t>
-              <w:br/>
-              <w:t>• Interfaces transaccionales de Órdenes de Compra y Pedidos de Venta [RF-10, RF-14].</w:t>
-              <w:br/>
-              <w:t>• Módulo de pagos y conciliación visual [RF-16 al RF-20].</w:t>
-              <w:br/>
-              <w:t>• Construcción del Dashboard y gráficos interactivos [RF-21 al RF-29].</w:t>
+            </w:pPr>
+            <w:r>
+              <w:rPr>
+                <w:b/>
+                <w:color w:val="475569"/>
+              </w:rPr>
+              <w:t xml:space="preserve">• </w:t>
+            </w:r>
+            <w:r>
+              <w:rPr>
+                <w:sz w:val="19"/>
+              </w:rPr>
+              <w:t>Formulario de Login y Registro de Usuarios [RF-01].</w:t>
+            </w:r>
+          </w:p>
+          <w:p>
+            <w:pPr>
+              <w:pStyle w:val="Normal"/>
+              <w:spacing w:lineRule="auto" w:line="264" w:before="0" w:after="40"/>
+              <w:ind w:left="216" w:hanging="0"/>
+              <w:rPr/>
+            </w:pPr>
+            <w:r>
+              <w:rPr>
+                <w:b/>
+                <w:color w:val="475569"/>
+              </w:rPr>
+              <w:t xml:space="preserve">• </w:t>
+            </w:r>
+            <w:r>
+              <w:rPr>
+                <w:sz w:val="19"/>
+              </w:rPr>
+              <w:t>Pantalla de Recuperación de Cuenta [RF-02].</w:t>
+            </w:r>
+          </w:p>
+          <w:p>
+            <w:pPr>
+              <w:pStyle w:val="Normal"/>
+              <w:spacing w:before="160" w:after="40"/>
+              <w:rPr/>
+            </w:pPr>
+            <w:r>
+              <w:rPr>
+                <w:b/>
+              </w:rPr>
+              <w:t>Etapa 2: Catálogo e Inventario</w:t>
+            </w:r>
+          </w:p>
+          <w:p>
+            <w:pPr>
+              <w:pStyle w:val="Normal"/>
+              <w:spacing w:lineRule="auto" w:line="264" w:before="0" w:after="40"/>
+              <w:ind w:left="216" w:hanging="0"/>
+              <w:rPr/>
+            </w:pPr>
+            <w:r>
+              <w:rPr>
+                <w:b/>
+                <w:color w:val="475569"/>
+              </w:rPr>
+              <w:t xml:space="preserve">• </w:t>
+            </w:r>
+            <w:r>
+              <w:rPr>
+                <w:sz w:val="19"/>
+              </w:rPr>
+              <w:t>Tabla de listado interactiva para Productos [RF-04, RF-05].</w:t>
+            </w:r>
+          </w:p>
+          <w:p>
+            <w:pPr>
+              <w:pStyle w:val="Normal"/>
+              <w:spacing w:lineRule="auto" w:line="264" w:before="0" w:after="40"/>
+              <w:ind w:left="216" w:hanging="0"/>
+              <w:rPr/>
+            </w:pPr>
+            <w:r>
+              <w:rPr>
+                <w:b/>
+                <w:color w:val="475569"/>
+              </w:rPr>
+              <w:t xml:space="preserve">• </w:t>
+            </w:r>
+            <w:r>
+              <w:rPr>
+                <w:sz w:val="19"/>
+              </w:rPr>
+              <w:t>Formularios con validaciones para Alta/Edición de Productos [RF-03].</w:t>
+            </w:r>
+          </w:p>
+          <w:p>
+            <w:pPr>
+              <w:pStyle w:val="Normal"/>
+              <w:spacing w:lineRule="auto" w:line="264" w:before="0" w:after="40"/>
+              <w:ind w:left="216" w:hanging="0"/>
+              <w:rPr/>
+            </w:pPr>
+            <w:r>
+              <w:rPr>
+                <w:b/>
+                <w:color w:val="475569"/>
+              </w:rPr>
+              <w:t xml:space="preserve">• </w:t>
+            </w:r>
+            <w:r>
+              <w:rPr>
+                <w:sz w:val="19"/>
+              </w:rPr>
+              <w:t>Componentes visuales de historial y alertas de stock [RF-06, RF-07].</w:t>
+            </w:r>
+          </w:p>
+          <w:p>
+            <w:pPr>
+              <w:pStyle w:val="Normal"/>
+              <w:spacing w:before="160" w:after="40"/>
+              <w:rPr/>
+            </w:pPr>
+            <w:r>
+              <w:rPr>
+                <w:b/>
+              </w:rPr>
+              <w:t>Etapa 3: Entidades y Compras</w:t>
+            </w:r>
+          </w:p>
+          <w:p>
+            <w:pPr>
+              <w:pStyle w:val="Normal"/>
+              <w:spacing w:lineRule="auto" w:line="264" w:before="0" w:after="40"/>
+              <w:ind w:left="216" w:hanging="0"/>
+              <w:rPr/>
+            </w:pPr>
+            <w:r>
+              <w:rPr>
+                <w:b/>
+                <w:color w:val="475569"/>
+              </w:rPr>
+              <w:t xml:space="preserve">• </w:t>
+            </w:r>
+            <w:r>
+              <w:rPr>
+                <w:sz w:val="19"/>
+              </w:rPr>
+              <w:t>Listados y formularios CRUD para Proveedores [RF-08, RF-09].</w:t>
+            </w:r>
+          </w:p>
+          <w:p>
+            <w:pPr>
+              <w:pStyle w:val="Normal"/>
+              <w:spacing w:lineRule="auto" w:line="264" w:before="0" w:after="40"/>
+              <w:ind w:left="216" w:hanging="0"/>
+              <w:rPr/>
+            </w:pPr>
+            <w:r>
+              <w:rPr>
+                <w:b/>
+                <w:color w:val="475569"/>
+              </w:rPr>
+              <w:t xml:space="preserve">• </w:t>
+            </w:r>
+            <w:r>
+              <w:rPr>
+                <w:sz w:val="19"/>
+              </w:rPr>
+              <w:t>Listados y formularios CRUD para Clientes [RF-12, RF-13].</w:t>
+            </w:r>
+          </w:p>
+          <w:p>
+            <w:pPr>
+              <w:pStyle w:val="Normal"/>
+              <w:spacing w:lineRule="auto" w:line="264" w:before="0" w:after="40"/>
+              <w:ind w:left="216" w:hanging="0"/>
+              <w:rPr/>
+            </w:pPr>
+            <w:r>
+              <w:rPr>
+                <w:b/>
+                <w:color w:val="475569"/>
+              </w:rPr>
+              <w:t xml:space="preserve">• </w:t>
+            </w:r>
+            <w:r>
+              <w:rPr>
+                <w:sz w:val="19"/>
+              </w:rPr>
+              <w:t>Pantalla de generación de Órdenes de Compra con selector múltiple [RF-10].</w:t>
+            </w:r>
+          </w:p>
+          <w:p>
+            <w:pPr>
+              <w:pStyle w:val="Normal"/>
+              <w:spacing w:before="160" w:after="40"/>
+              <w:rPr/>
+            </w:pPr>
+            <w:r>
+              <w:rPr>
+                <w:b/>
+              </w:rPr>
+              <w:t>Etapa 4: Ventas y Pagos</w:t>
+            </w:r>
+          </w:p>
+          <w:p>
+            <w:pPr>
+              <w:pStyle w:val="Normal"/>
+              <w:spacing w:lineRule="auto" w:line="264" w:before="0" w:after="40"/>
+              <w:ind w:left="216" w:hanging="0"/>
+              <w:rPr/>
+            </w:pPr>
+            <w:r>
+              <w:rPr>
+                <w:b/>
+                <w:color w:val="475569"/>
+              </w:rPr>
+              <w:t xml:space="preserve">• </w:t>
+            </w:r>
+            <w:r>
+              <w:rPr>
+                <w:sz w:val="19"/>
+              </w:rPr>
+              <w:t>Interfaz interactiva para Pedidos de Venta (tipo carrito) [RF-14].</w:t>
+            </w:r>
+          </w:p>
+          <w:p>
+            <w:pPr>
+              <w:pStyle w:val="Normal"/>
+              <w:spacing w:lineRule="auto" w:line="264" w:before="0" w:after="40"/>
+              <w:ind w:left="216" w:hanging="0"/>
+              <w:rPr/>
+            </w:pPr>
+            <w:r>
+              <w:rPr>
+                <w:b/>
+                <w:color w:val="475569"/>
+              </w:rPr>
+              <w:t xml:space="preserve">• </w:t>
+            </w:r>
+            <w:r>
+              <w:rPr>
+                <w:sz w:val="19"/>
+              </w:rPr>
+              <w:t>Interfaz para Generación de Presupuestos [RF-11].</w:t>
+            </w:r>
+          </w:p>
+          <w:p>
+            <w:pPr>
+              <w:pStyle w:val="Normal"/>
+              <w:spacing w:lineRule="auto" w:line="264" w:before="0" w:after="40"/>
+              <w:ind w:left="216" w:hanging="0"/>
+              <w:rPr/>
+            </w:pPr>
+            <w:r>
+              <w:rPr>
+                <w:b/>
+                <w:color w:val="475569"/>
+              </w:rPr>
+              <w:t xml:space="preserve">• </w:t>
+            </w:r>
+            <w:r>
+              <w:rPr>
+                <w:sz w:val="19"/>
+              </w:rPr>
+              <w:t>Vistas de gestión de pagos y conciliación de facturas [RF-16 al RF-20].</w:t>
+            </w:r>
+          </w:p>
+          <w:p>
+            <w:pPr>
+              <w:pStyle w:val="Normal"/>
+              <w:spacing w:before="160" w:after="40"/>
+              <w:rPr/>
+            </w:pPr>
+            <w:r>
+              <w:rPr>
+                <w:b/>
+              </w:rPr>
+              <w:t>Etapa 5: Dashboard y Analítica</w:t>
+            </w:r>
+          </w:p>
+          <w:p>
+            <w:pPr>
+              <w:pStyle w:val="Normal"/>
+              <w:spacing w:lineRule="auto" w:line="264" w:before="0" w:after="40"/>
+              <w:ind w:left="216" w:hanging="0"/>
+              <w:rPr/>
+            </w:pPr>
+            <w:r>
+              <w:rPr>
+                <w:b/>
+                <w:color w:val="475569"/>
+              </w:rPr>
+              <w:t xml:space="preserve">• </w:t>
+            </w:r>
+            <w:r>
+              <w:rPr>
+                <w:sz w:val="19"/>
+              </w:rPr>
+              <w:t>Maquetación de tarjetas (KPIs) para ingresos y márgenes [RF-21, RF-25].</w:t>
+            </w:r>
+          </w:p>
+          <w:p>
+            <w:pPr>
+              <w:pStyle w:val="Normal"/>
+              <w:spacing w:lineRule="auto" w:line="264" w:before="0" w:after="40"/>
+              <w:ind w:left="216" w:hanging="0"/>
+              <w:rPr/>
+            </w:pPr>
+            <w:r>
+              <w:rPr>
+                <w:b/>
+                <w:color w:val="475569"/>
+              </w:rPr>
+              <w:t xml:space="preserve">• </w:t>
+            </w:r>
+            <w:r>
+              <w:rPr>
+                <w:sz w:val="19"/>
+              </w:rPr>
+              <w:t>Integración de librería de gráficos para tendencias [RF-22].</w:t>
+            </w:r>
+          </w:p>
+          <w:p>
+            <w:pPr>
+              <w:pStyle w:val="Normal"/>
+              <w:spacing w:lineRule="auto" w:line="264" w:before="0" w:after="40"/>
+              <w:ind w:left="216" w:hanging="0"/>
+              <w:rPr/>
+            </w:pPr>
+            <w:r>
+              <w:rPr>
+                <w:b/>
+                <w:color w:val="475569"/>
+              </w:rPr>
+              <w:t xml:space="preserve">• </w:t>
+            </w:r>
+            <w:r>
+              <w:rPr>
+                <w:sz w:val="19"/>
+              </w:rPr>
+              <w:t>Tablas de ranking (productos/proveedores) [RF-23, RF-24].</w:t>
+            </w:r>
+          </w:p>
+          <w:p>
+            <w:pPr>
+              <w:pStyle w:val="Normal"/>
+              <w:spacing w:lineRule="auto" w:line="264" w:before="0" w:after="40"/>
+              <w:ind w:left="216" w:hanging="0"/>
+              <w:rPr/>
+            </w:pPr>
+            <w:r>
+              <w:rPr>
+                <w:b/>
+                <w:color w:val="475569"/>
+              </w:rPr>
+              <w:t xml:space="preserve">• </w:t>
+            </w:r>
+            <w:r>
+              <w:rPr>
+                <w:sz w:val="19"/>
+              </w:rPr>
+              <w:t>Filtros de fecha globales y botones de exportación [RF-28, RF-29].</w:t>
             </w:r>
           </w:p>
         </w:tc>
@@ -465,29 +935,200 @@
           <w:p>
             <w:pPr>
               <w:pStyle w:val="Normal"/>
-              <w:widowControl/>
-              <w:bidi w:val="0"/>
-              <w:spacing w:lineRule="auto" w:line="276" w:before="0" w:after="200"/>
-              <w:jc w:val="left"/>
+              <w:spacing w:before="0" w:after="40"/>
               <w:rPr/>
             </w:pPr>
             <w:r>
+              <w:rPr>
+                <w:b/>
+              </w:rPr>
+              <w:t>Etapa 1: Core y Seguridad</w:t>
+            </w:r>
+          </w:p>
+          <w:p>
+            <w:pPr>
+              <w:pStyle w:val="Normal"/>
+              <w:spacing w:lineRule="auto" w:line="264" w:before="0" w:after="40"/>
+              <w:ind w:left="216" w:hanging="0"/>
               <w:rPr/>
+            </w:pPr>
+            <w:r>
+              <w:rPr>
+                <w:b/>
+                <w:color w:val="475569"/>
+              </w:rPr>
               <w:t xml:space="preserve">• </w:t>
             </w:r>
             <w:r>
+              <w:rPr>
+                <w:sz w:val="19"/>
+              </w:rPr>
+              <w:t>autenticación JWT [RF-01, RF-02].</w:t>
+            </w:r>
+          </w:p>
+          <w:p>
+            <w:pPr>
+              <w:pStyle w:val="Normal"/>
+              <w:spacing w:lineRule="auto" w:line="264" w:before="0" w:after="40"/>
+              <w:ind w:left="216" w:hanging="0"/>
               <w:rPr/>
-              <w:t>Autenticación JWT y roles [RF-01, RF-02].</w:t>
-              <w:br/>
-              <w:t>• Endpoints REST para gestión de entidades e inventario [RF-03 al RF-07].</w:t>
-              <w:br/>
-              <w:t>• Algoritmos de presupuestos, facturación y márgenes [RF-11, RF-15, RF-25].</w:t>
-              <w:br/>
-              <w:t>• Integración con API de MercadoPago [RF-16, RF-17].</w:t>
-              <w:br/>
-              <w:t>• Procesamiento de tendencias y predicción [RF-22, RF-27].</w:t>
-              <w:br/>
-              <w:t>• Tareas en segundo plano (Celery) para reportes y notificaciones [RF-28, RF-30].</w:t>
+            </w:pPr>
+            <w:r>
+              <w:rPr>
+                <w:b/>
+                <w:color w:val="475569"/>
+              </w:rPr>
+              <w:t xml:space="preserve">• </w:t>
+            </w:r>
+            <w:r>
+              <w:rPr>
+                <w:sz w:val="19"/>
+              </w:rPr>
+              <w:t>Endpoints CRUD de Productos y control de inventario [RF-03 al RF-07].</w:t>
+            </w:r>
+          </w:p>
+          <w:p>
+            <w:pPr>
+              <w:pStyle w:val="Normal"/>
+              <w:spacing w:before="160" w:after="40"/>
+              <w:rPr/>
+            </w:pPr>
+            <w:r>
+              <w:rPr>
+                <w:b/>
+              </w:rPr>
+              <w:t>Etapa 2: Lógica Transaccional</w:t>
+            </w:r>
+          </w:p>
+          <w:p>
+            <w:pPr>
+              <w:pStyle w:val="Normal"/>
+              <w:spacing w:lineRule="auto" w:line="264" w:before="0" w:after="40"/>
+              <w:ind w:left="216" w:hanging="0"/>
+              <w:rPr/>
+            </w:pPr>
+            <w:r>
+              <w:rPr>
+                <w:b/>
+                <w:color w:val="475569"/>
+              </w:rPr>
+              <w:t xml:space="preserve">• </w:t>
+            </w:r>
+            <w:r>
+              <w:rPr>
+                <w:sz w:val="19"/>
+              </w:rPr>
+              <w:t>Endpoints CRUD de Clientes y Proveedores [RF-08, RF-09, RF-12, RF-13].</w:t>
+            </w:r>
+          </w:p>
+          <w:p>
+            <w:pPr>
+              <w:pStyle w:val="Normal"/>
+              <w:spacing w:lineRule="auto" w:line="264" w:before="0" w:after="40"/>
+              <w:ind w:left="216" w:hanging="0"/>
+              <w:rPr/>
+            </w:pPr>
+            <w:r>
+              <w:rPr>
+                <w:b/>
+                <w:color w:val="475569"/>
+              </w:rPr>
+              <w:t xml:space="preserve">• </w:t>
+            </w:r>
+            <w:r>
+              <w:rPr>
+                <w:sz w:val="19"/>
+              </w:rPr>
+              <w:t>Lógica de validación para Pedidos de Venta y Compras [RF-10, RF-14].</w:t>
+            </w:r>
+          </w:p>
+          <w:p>
+            <w:pPr>
+              <w:pStyle w:val="Normal"/>
+              <w:spacing w:before="160" w:after="40"/>
+              <w:rPr/>
+            </w:pPr>
+            <w:r>
+              <w:rPr>
+                <w:b/>
+              </w:rPr>
+              <w:t>Etapa 3: Facturación y Reportes</w:t>
+            </w:r>
+          </w:p>
+          <w:p>
+            <w:pPr>
+              <w:pStyle w:val="Normal"/>
+              <w:spacing w:lineRule="auto" w:line="264" w:before="0" w:after="40"/>
+              <w:ind w:left="216" w:hanging="0"/>
+              <w:rPr/>
+            </w:pPr>
+            <w:r>
+              <w:rPr>
+                <w:b/>
+                <w:color w:val="475569"/>
+              </w:rPr>
+              <w:t xml:space="preserve">• </w:t>
+            </w:r>
+            <w:r>
+              <w:rPr>
+                <w:sz w:val="19"/>
+              </w:rPr>
+              <w:t>Integración con API de MercadoPago y endpoints de conciliación [RF-16 al RF-20].</w:t>
+            </w:r>
+          </w:p>
+          <w:p>
+            <w:pPr>
+              <w:pStyle w:val="Normal"/>
+              <w:spacing w:lineRule="auto" w:line="264" w:before="0" w:after="40"/>
+              <w:ind w:left="216" w:hanging="0"/>
+              <w:rPr/>
+            </w:pPr>
+            <w:r>
+              <w:rPr>
+                <w:b/>
+                <w:color w:val="475569"/>
+              </w:rPr>
+              <w:t xml:space="preserve">• </w:t>
+            </w:r>
+            <w:r>
+              <w:rPr>
+                <w:sz w:val="19"/>
+              </w:rPr>
+              <w:t>Algoritmos de cálculo de márgenes, tendencias y predicciones [RF-21 al RF-27].</w:t>
+            </w:r>
+          </w:p>
+          <w:p>
+            <w:pPr>
+              <w:pStyle w:val="Normal"/>
+              <w:spacing w:before="160" w:after="40"/>
+              <w:rPr/>
+            </w:pPr>
+            <w:r>
+              <w:rPr>
+                <w:b/>
+              </w:rPr>
+              <w:t>Etapa 4: Tareas Asíncronas</w:t>
+            </w:r>
+          </w:p>
+          <w:p>
+            <w:pPr>
+              <w:pStyle w:val="Normal"/>
+              <w:spacing w:lineRule="auto" w:line="264" w:before="0" w:after="40"/>
+              <w:ind w:left="216" w:hanging="0"/>
+              <w:rPr/>
+            </w:pPr>
+            <w:r>
+              <w:rPr>
+                <w:b/>
+                <w:color w:val="475569"/>
+              </w:rPr>
+              <w:t xml:space="preserve">• </w:t>
+            </w:r>
+            <w:r>
+              <w:rPr>
+                <w:sz w:val="19"/>
+              </w:rPr>
+              <w:t>Webhooks y configuración para envío de correos [RF-15, RF-30].</w:t>
             </w:r>
           </w:p>
         </w:tc>
@@ -560,22 +1201,56 @@
           <w:p>
             <w:pPr>
               <w:pStyle w:val="Normal"/>
-              <w:widowControl/>
-              <w:bidi w:val="0"/>
-              <w:spacing w:lineRule="auto" w:line="276" w:before="0" w:after="200"/>
-              <w:jc w:val="left"/>
+              <w:spacing w:before="0" w:after="40"/>
               <w:rPr/>
             </w:pPr>
             <w:r>
+              <w:rPr>
+                <w:b/>
+              </w:rPr>
+              <w:t>Etapa 1: Testing y Despliegue</w:t>
+            </w:r>
+          </w:p>
+          <w:p>
+            <w:pPr>
+              <w:pStyle w:val="Normal"/>
+              <w:spacing w:lineRule="auto" w:line="264" w:before="0" w:after="40"/>
+              <w:ind w:left="216" w:hanging="0"/>
               <w:rPr/>
-              <w:br/>
-              <w:t xml:space="preserve">• Despliegue en servidor </w:t>
-              <w:br/>
-              <w:t>• Configuración SSL/HTTPS y Nginx.</w:t>
-              <w:br/>
-              <w:t>• Testing End-to-End y pruebas de carga concurrente [RNF-04].</w:t>
-              <w:br/>
-              <w:t>• Habilitación de scripts de backups diarios [RNF-14].</w:t>
+            </w:pPr>
+            <w:r>
+              <w:rPr>
+                <w:b/>
+                <w:color w:val="475569"/>
+              </w:rPr>
+              <w:t xml:space="preserve">• </w:t>
+            </w:r>
+            <w:r>
+              <w:rPr>
+                <w:sz w:val="19"/>
+              </w:rPr>
+              <w:t>Despliegue en servidor .</w:t>
+            </w:r>
+          </w:p>
+          <w:p>
+            <w:pPr>
+              <w:pStyle w:val="Normal"/>
+              <w:spacing w:lineRule="auto" w:line="264" w:before="0" w:after="40"/>
+              <w:ind w:left="216" w:hanging="0"/>
+              <w:rPr/>
+            </w:pPr>
+            <w:r>
+              <w:rPr>
+                <w:b/>
+                <w:color w:val="475569"/>
+              </w:rPr>
+              <w:t xml:space="preserve">• </w:t>
+            </w:r>
+            <w:r>
+              <w:rPr>
+                <w:sz w:val="19"/>
+              </w:rPr>
+              <w:t>Testing End-to-End, carga concurrente y backups [RNF-04, RNF-14].</w:t>
             </w:r>
           </w:p>
         </w:tc>
@@ -761,7 +1436,7 @@
       <w:rFonts w:ascii="Calibri" w:hAnsi="Calibri" w:eastAsia="ＭＳ 明朝" w:cs=""/>
       <w:color w:val="1E293B"/>
       <w:kern w:val="0"/>
-      <w:sz w:val="22"/>
+      <w:sz w:val="20"/>
       <w:szCs w:val="22"/>
       <w:lang w:val="en-US" w:eastAsia="en-US" w:bidi="ar-SA"/>
     </w:rPr>
@@ -1447,7 +2122,7 @@
       <w:rFonts w:ascii="Cambria" w:hAnsi="Cambria" w:eastAsia="ＭＳ 明朝" w:cs="" w:asciiTheme="minorHAnsi" w:cstheme="minorBidi" w:eastAsiaTheme="minorEastAsia" w:hAnsiTheme="minorHAnsi"/>
       <w:color w:val="auto"/>
       <w:kern w:val="0"/>
-      <w:sz w:val="22"/>
+      <w:sz w:val="20"/>
       <w:szCs w:val="22"/>
       <w:lang w:val="en-US" w:eastAsia="en-US" w:bidi="ar-SA"/>
     </w:rPr>

</xml_diff>